<commit_message>
Replace another student's name in Practical 8 header with own details
Co-Authored-By: Claude Sonnet 5.5 <noreply@anthropic.com>
Claude-Session: https://claude.ai/code/session_01GtPcDJLiBtC54H93jMoEqQ
</commit_message>
<xml_diff>
--- a/SE_Exp8_B106.docx
+++ b/SE_Exp8_B106.docx
@@ -4935,7 +4935,7 @@
                             <w:rPr>
                               <w:color w:val="999999"/>
                             </w:rPr>
-                            <w:t>K050</w:t>
+                            <w:t>B106</w:t>
                           </w:r>
                           <w:r>
                             <w:rPr>
@@ -4948,14 +4948,14 @@
                             <w:rPr>
                               <w:color w:val="999999"/>
                             </w:rPr>
-                            <w:t>Freya</w:t>
+                            <w:t>Krishang</w:t>
                           </w:r>
                           <w:r>
                             <w:rPr>
                               <w:color w:val="999999"/>
                               <w:spacing w:val="-4"/>
                             </w:rPr>
-                            <w:t xml:space="preserve"> Shah</w:t>
+                            <w:t xml:space="preserve"> Vikram Singh</w:t>
                           </w:r>
                         </w:p>
                       </w:txbxContent>
@@ -4987,7 +4987,7 @@
                       <w:rPr>
                         <w:color w:val="999999"/>
                       </w:rPr>
-                      <w:t>K050</w:t>
+                      <w:t>B106</w:t>
                     </w:r>
                     <w:r>
                       <w:rPr>
@@ -5000,14 +5000,14 @@
                       <w:rPr>
                         <w:color w:val="999999"/>
                       </w:rPr>
-                      <w:t>Freya</w:t>
+                      <w:t>Krishang</w:t>
                     </w:r>
                     <w:r>
                       <w:rPr>
                         <w:color w:val="999999"/>
                         <w:spacing w:val="-4"/>
                       </w:rPr>
-                      <w:t xml:space="preserve"> Shah</w:t>
+                      <w:t xml:space="preserve"> Vikram Singh</w:t>
                     </w:r>
                   </w:p>
                 </w:txbxContent>

</xml_diff>